<commit_message>
Merge Leroy's yellow text into 8.1, 8.3, 8.6; house style (Monash-blue headings, ruled tables); fix stale 7.5% construction share; App B notes the 4.40 re-base effect
Co-Authored-By: Claude Opus 5.5 <noreply@anthropic.com>
Claude-Session: https://claude.ai/code/session_01SZLM437PwZArBFHgvvPCk4
</commit_message>
<xml_diff>
--- a/01_Report/assembly/reference.docx
+++ b/01_Report/assembly/reference.docx
@@ -1866,6 +1866,7 @@
     <w:rPr>
       <w:sz w:val="40"/>
       <w:szCs w:val="40"/>
+      <w:color w:val="006DAE"/>
     </w:rPr>
   </w:style>
   <w:style w:type="paragraph" w:styleId="Heading2">
@@ -1883,6 +1884,7 @@
       <w:bCs w:val="0"/>
       <w:sz w:val="32"/>
       <w:szCs w:val="32"/>
+      <w:color w:val="006DAE"/>
     </w:rPr>
   </w:style>
   <w:style w:type="paragraph" w:styleId="Heading3">
@@ -1901,6 +1903,7 @@
       <w:color w:val="434343"/>
       <w:sz w:val="28"/>
       <w:szCs w:val="28"/>
+      <w:color w:val="006DAE"/>
     </w:rPr>
   </w:style>
   <w:style w:type="paragraph" w:styleId="Heading4">
@@ -1966,6 +1969,7 @@
     <w:rPr>
       <w:sz w:val="52"/>
       <w:szCs w:val="52"/>
+      <w:color w:val="006DAE"/>
     </w:rPr>
   </w:style>
   <w:style w:type="paragraph" w:styleId="Normal" w:default="1">
@@ -2170,31 +2174,30 @@
   <w:style w:type="table" w:default="1" w:styleId="Table">
     <w:name w:val="Table"/>
     <w:basedOn w:val="TableNormal"/>
-    <w:semiHidden/>
-    <w:unhideWhenUsed/>
     <w:qFormat/>
+    <w:pPr>
+      <w:spacing w:before="20" w:after="20"/>
+    </w:pPr>
     <w:tblPr>
       <w:tblInd w:w="0" w:type="dxa"/>
+      <w:tblBorders>
+        <w:top w:val="single" w:sz="8" w:space="0" w:color="006DAE"/>
+        <w:bottom w:val="single" w:sz="8" w:space="0" w:color="006DAE"/>
+        <w:insideH w:val="single" w:sz="4" w:space="0" w:color="D0D7DE"/>
+      </w:tblBorders>
       <w:tblCellMar>
-        <w:top w:w="0" w:type="dxa"/>
-        <w:left w:w="108" w:type="dxa"/>
-        <w:bottom w:w="0" w:type="dxa"/>
-        <w:right w:w="108" w:type="dxa"/>
+        <w:top w:w="30" w:type="dxa"/>
+        <w:left w:w="80" w:type="dxa"/>
+        <w:bottom w:w="30" w:type="dxa"/>
+        <w:right w:w="80" w:type="dxa"/>
       </w:tblCellMar>
     </w:tblPr>
     <w:tblStylePr w:type="firstRow">
-      <w:tblPr>
-        <w:jc w:val="left"/>
-        <w:tblInd w:w="0" w:type="dxa"/>
-      </w:tblPr>
-      <w:trPr>
-        <w:jc w:val="left"/>
-      </w:trPr>
+      <w:rPr>
+        <w:b/>
+      </w:rPr>
       <w:tcPr>
-        <w:vAlign w:val="bottom"/>
-        <w:tcBorders>
-          <w:bottom w:val="single"/>
-        </w:tcBorders>
+        <w:shd w:val="clear" w:color="auto" w:fill="DCE9F5"/>
       </w:tcPr>
     </w:tblStylePr>
   </w:style>
@@ -2232,20 +2235,37 @@
     <w:pPr>
       <w:keepNext/>
     </w:pPr>
+    <w:rPr>
+      <w:color w:val="555555"/>
+      <w:sz w:val="19"/>
+      <w:szCs w:val="19"/>
+    </w:rPr>
   </w:style>
   <w:style w:type="paragraph" w:customStyle="1" w:styleId="ImageCaption">
     <w:name w:val="Image Caption"/>
     <w:basedOn w:val="Caption"/>
+    <w:rPr>
+      <w:color w:val="555555"/>
+      <w:sz w:val="19"/>
+      <w:szCs w:val="19"/>
+    </w:rPr>
+    <w:pPr>
+      <w:jc w:val="center"/>
+    </w:pPr>
   </w:style>
   <w:style w:type="paragraph" w:customStyle="1" w:styleId="Figure">
     <w:name w:val="Figure"/>
     <w:basedOn w:val="Normal"/>
+    <w:pPr>
+      <w:jc w:val="center"/>
+    </w:pPr>
   </w:style>
   <w:style w:type="paragraph" w:customStyle="1" w:styleId="CaptionedFigure">
     <w:name w:val="Captioned Figure"/>
     <w:basedOn w:val="Figure"/>
     <w:pPr>
       <w:keepNext/>
+      <w:jc w:val="center"/>
     </w:pPr>
   </w:style>
   <w:style w:type="character" w:customStyle="1" w:styleId="BodyTextChar">

</xml_diff>

<commit_message>
Match the team template: title page, abstract page, filled contents, 1-5 structure with Discussion 3.1-3.8 (cross-references renumbered), black headings, neutral tables
Co-Authored-By: Claude Opus 5.5 <noreply@anthropic.com>
Claude-Session: https://claude.ai/code/session_01SZLM437PwZArBFHgvvPCk4
</commit_message>
<xml_diff>
--- a/01_Report/assembly/reference.docx
+++ b/01_Report/assembly/reference.docx
@@ -1862,11 +1862,11 @@
       <w:keepLines w:val="1"/>
       <w:pageBreakBefore w:val="0"/>
       <w:spacing w:after="120" w:before="400" w:lineRule="auto"/>
+      <w:outlineLvl w:val="0"/>
     </w:pPr>
     <w:rPr>
       <w:sz w:val="40"/>
       <w:szCs w:val="40"/>
-      <w:color w:val="006DAE"/>
     </w:rPr>
   </w:style>
   <w:style w:type="paragraph" w:styleId="Heading2">
@@ -1878,13 +1878,13 @@
       <w:keepLines w:val="1"/>
       <w:pageBreakBefore w:val="0"/>
       <w:spacing w:after="120" w:before="360" w:lineRule="auto"/>
+      <w:outlineLvl w:val="1"/>
     </w:pPr>
     <w:rPr>
       <w:b w:val="0"/>
       <w:bCs w:val="0"/>
       <w:sz w:val="32"/>
       <w:szCs w:val="32"/>
-      <w:color w:val="006DAE"/>
     </w:rPr>
   </w:style>
   <w:style w:type="paragraph" w:styleId="Heading3">
@@ -1896,6 +1896,7 @@
       <w:keepLines w:val="1"/>
       <w:pageBreakBefore w:val="0"/>
       <w:spacing w:after="80" w:before="320" w:lineRule="auto"/>
+      <w:outlineLvl w:val="2"/>
     </w:pPr>
     <w:rPr>
       <w:b w:val="0"/>
@@ -1903,7 +1904,6 @@
       <w:color w:val="434343"/>
       <w:sz w:val="28"/>
       <w:szCs w:val="28"/>
-      <w:color w:val="006DAE"/>
     </w:rPr>
   </w:style>
   <w:style w:type="paragraph" w:styleId="Heading4">
@@ -1915,6 +1915,7 @@
       <w:keepLines w:val="1"/>
       <w:pageBreakBefore w:val="0"/>
       <w:spacing w:after="80" w:before="280" w:lineRule="auto"/>
+      <w:outlineLvl w:val="3"/>
     </w:pPr>
     <w:rPr>
       <w:color w:val="666666"/>
@@ -1969,7 +1970,6 @@
     <w:rPr>
       <w:sz w:val="52"/>
       <w:szCs w:val="52"/>
-      <w:color w:val="006DAE"/>
     </w:rPr>
   </w:style>
   <w:style w:type="paragraph" w:styleId="Normal" w:default="1">
@@ -2181,8 +2181,8 @@
     <w:tblPr>
       <w:tblInd w:w="0" w:type="dxa"/>
       <w:tblBorders>
-        <w:top w:val="single" w:sz="8" w:space="0" w:color="006DAE"/>
-        <w:bottom w:val="single" w:sz="8" w:space="0" w:color="006DAE"/>
+        <w:top w:val="single" w:sz="8" w:space="0" w:color="595959"/>
+        <w:bottom w:val="single" w:sz="8" w:space="0" w:color="595959"/>
         <w:insideH w:val="single" w:sz="4" w:space="0" w:color="D0D7DE"/>
       </w:tblBorders>
       <w:tblCellMar>
@@ -2197,7 +2197,7 @@
         <w:b/>
       </w:rPr>
       <w:tcPr>
-        <w:shd w:val="clear" w:color="auto" w:fill="DCE9F5"/>
+        <w:shd w:val="clear" w:color="auto" w:fill="EDEDED"/>
       </w:tcPr>
     </w:tblStylePr>
   </w:style>

</xml_diff>

<commit_message>
Contents styled as in the team template: bold level 1, indented levels 2-3, dotted leaders; reference sub-headings left out of the contents
Co-Authored-By: Claude Opus 5.5 <noreply@anthropic.com>
Claude-Session: https://claude.ai/code/session_01SZLM437PwZArBFHgvvPCk4
</commit_message>
<xml_diff>
--- a/01_Report/assembly/reference.docx
+++ b/01_Report/assembly/reference.docx
@@ -2317,6 +2317,65 @@
       <w:color w:val="365F91" w:themeColor="accent1" w:themeShade="BF"/>
     </w:rPr>
   </w:style>
+  <w:style w:type="paragraph" w:styleId="TOC1">
+    <w:name w:val="toc 1"/>
+    <w:basedOn w:val="Normal"/>
+    <w:next w:val="Normal"/>
+    <w:uiPriority w:val="39"/>
+    <w:unhideWhenUsed/>
+    <w:pPr>
+      <w:tabs>
+        <w:tab w:val="right" w:leader="dot" w:pos="9026"/>
+      </w:tabs>
+      <w:spacing w:before="60" w:after="60" w:line="240" w:lineRule="auto"/>
+      <w:ind w:left="0"/>
+    </w:pPr>
+    <w:rPr>
+      <w:rFonts w:ascii="Arial" w:hAnsi="Arial" w:cs="Arial"/>
+      <w:b/>
+      <w:bCs/>
+      <w:sz w:val="22"/>
+      <w:szCs w:val="22"/>
+    </w:rPr>
+  </w:style>
+  <w:style w:type="paragraph" w:styleId="TOC2">
+    <w:name w:val="toc 2"/>
+    <w:basedOn w:val="Normal"/>
+    <w:next w:val="Normal"/>
+    <w:uiPriority w:val="39"/>
+    <w:unhideWhenUsed/>
+    <w:pPr>
+      <w:tabs>
+        <w:tab w:val="right" w:leader="dot" w:pos="9026"/>
+      </w:tabs>
+      <w:spacing w:before="60" w:after="60" w:line="240" w:lineRule="auto"/>
+      <w:ind w:left="720"/>
+    </w:pPr>
+    <w:rPr>
+      <w:rFonts w:ascii="Arial" w:hAnsi="Arial" w:cs="Arial"/>
+      <w:sz w:val="22"/>
+      <w:szCs w:val="22"/>
+    </w:rPr>
+  </w:style>
+  <w:style w:type="paragraph" w:styleId="TOC3">
+    <w:name w:val="toc 3"/>
+    <w:basedOn w:val="Normal"/>
+    <w:next w:val="Normal"/>
+    <w:uiPriority w:val="39"/>
+    <w:unhideWhenUsed/>
+    <w:pPr>
+      <w:tabs>
+        <w:tab w:val="right" w:leader="dot" w:pos="9026"/>
+      </w:tabs>
+      <w:spacing w:before="60" w:after="60" w:line="240" w:lineRule="auto"/>
+      <w:ind w:left="1440"/>
+    </w:pPr>
+    <w:rPr>
+      <w:rFonts w:ascii="Arial" w:hAnsi="Arial" w:cs="Arial"/>
+      <w:sz w:val="22"/>
+      <w:szCs w:val="22"/>
+    </w:rPr>
+  </w:style>
   <w:style w:type="character" w:customStyle="1" w:styleId="TeamNote">
     <w:name w:val="Team Note"/>
     <w:rPr>

</xml_diff>

<commit_message>
All tables: 1 pt black borders on every cell (set after the LibreOffice pass); remove stray horizontal rule
Co-Authored-By: Claude Opus 5.5 <noreply@anthropic.com>
Claude-Session: https://claude.ai/code/session_01SZLM437PwZArBFHgvvPCk4
</commit_message>
<xml_diff>
--- a/01_Report/assembly/reference.docx
+++ b/01_Report/assembly/reference.docx
@@ -2181,9 +2181,12 @@
     <w:tblPr>
       <w:tblInd w:w="0" w:type="dxa"/>
       <w:tblBorders>
-        <w:top w:val="single" w:sz="8" w:space="0" w:color="595959"/>
-        <w:bottom w:val="single" w:sz="8" w:space="0" w:color="595959"/>
-        <w:insideH w:val="single" w:sz="4" w:space="0" w:color="D0D7DE"/>
+        <w:top w:val="single" w:sz="8" w:space="0" w:color="000000"/>
+        <w:left w:val="single" w:sz="8" w:space="0" w:color="000000"/>
+        <w:bottom w:val="single" w:sz="8" w:space="0" w:color="000000"/>
+        <w:right w:val="single" w:sz="8" w:space="0" w:color="000000"/>
+        <w:insideH w:val="single" w:sz="8" w:space="0" w:color="000000"/>
+        <w:insideV w:val="single" w:sz="8" w:space="0" w:color="000000"/>
       </w:tblBorders>
       <w:tblCellMar>
         <w:top w:w="30" w:type="dxa"/>

</xml_diff>